<commit_message>
docs(PR-I): added link to video
</commit_message>
<xml_diff>
--- a/PR-I.docx
+++ b/PR-I.docx
@@ -1,6 +1,6 @@
 
 <file path=word/document.xml><?xml version="1.0" encoding="utf-8"?>
-<w:document xmlns:o="urn:schemas-microsoft-com:office:office" xmlns:r="http://schemas.openxmlformats.org/officeDocument/2006/relationships" xmlns:v="urn:schemas-microsoft-com:vml" xmlns:w="http://schemas.openxmlformats.org/wordprocessingml/2006/main" xmlns:w10="urn:schemas-microsoft-com:office:word" xmlns:wp="http://schemas.openxmlformats.org/drawingml/2006/wordprocessingDrawing" xmlns:wps="http://schemas.microsoft.com/office/word/2010/wordprocessingShape" xmlns:wpg="http://schemas.microsoft.com/office/word/2010/wordprocessingGroup" xmlns:mc="http://schemas.openxmlformats.org/markup-compatibility/2006" xmlns:wp14="http://schemas.microsoft.com/office/word/2010/wordprocessingDrawing" xmlns:w14="http://schemas.microsoft.com/office/word/2010/wordml" xmlns:w15="http://schemas.microsoft.com/office/word/2012/wordml" mc:Ignorable="w14 wp14 w15">
+<w:document xmlns:o="urn:schemas-microsoft-com:office:office" xmlns:r="http://schemas.openxmlformats.org/officeDocument/2006/relationships" xmlns:v="urn:schemas-microsoft-com:vml" xmlns:w="http://schemas.openxmlformats.org/wordprocessingml/2006/main" xmlns:w10="urn:schemas-microsoft-com:office:word" xmlns:wp="http://schemas.openxmlformats.org/drawingml/2006/wordprocessingDrawing" xmlns:pic="http://schemas.openxmlformats.org/drawingml/2006/picture" xmlns:wps="http://schemas.microsoft.com/office/word/2010/wordprocessingShape" xmlns:wpg="http://schemas.microsoft.com/office/word/2010/wordprocessingGroup" xmlns:mc="http://schemas.openxmlformats.org/markup-compatibility/2006" xmlns:wp14="http://schemas.microsoft.com/office/word/2010/wordprocessingDrawing" xmlns:w14="http://schemas.microsoft.com/office/word/2010/wordml" xmlns:w15="http://schemas.microsoft.com/office/word/2012/wordml" mc:Ignorable="w14 wp14 w15">
   <w:body>
     <w:p>
       <w:pPr>
@@ -301,7 +301,6 @@
         <w:rPr>
           <w:rFonts w:ascii="Times New Roman" w:hAnsi="Times New Roman" w:eastAsia="Times New Roman" w:cs="Times New Roman"/>
           <w:i w:val="false"/>
-          <w:i w:val="false"/>
           <w:iCs w:val="false"/>
         </w:rPr>
       </w:pPr>
@@ -323,7 +322,6 @@
         <w:rPr>
           <w:rFonts w:ascii="Times New Roman" w:hAnsi="Times New Roman" w:eastAsia="Times New Roman" w:cs="Times New Roman"/>
           <w:bCs/>
-          <w:i/>
           <w:i/>
           <w:sz w:val="13"/>
           <w:szCs w:val="13"/>
@@ -371,7 +369,6 @@
         <w:rPr>
           <w:rFonts w:ascii="Times New Roman" w:hAnsi="Times New Roman" w:eastAsia="Times New Roman" w:cs="Times New Roman"/>
           <w:i w:val="false"/>
-          <w:i w:val="false"/>
           <w:iCs w:val="false"/>
         </w:rPr>
       </w:pPr>
@@ -441,7 +438,6 @@
         <w:rPr>
           <w:rFonts w:ascii="Times New Roman" w:hAnsi="Times New Roman" w:eastAsia="Times New Roman" w:cs="Times New Roman"/>
           <w:i w:val="false"/>
-          <w:i w:val="false"/>
           <w:iCs w:val="false"/>
         </w:rPr>
       </w:pPr>
@@ -463,7 +459,6 @@
         <w:rPr>
           <w:rFonts w:ascii="Times New Roman" w:hAnsi="Times New Roman" w:eastAsia="Times New Roman" w:cs="Times New Roman"/>
           <w:i w:val="false"/>
-          <w:i w:val="false"/>
           <w:iCs w:val="false"/>
         </w:rPr>
       </w:pPr>
@@ -484,7 +479,6 @@
         <w:contextualSpacing/>
         <w:rPr>
           <w:rFonts w:ascii="Times New Roman" w:hAnsi="Times New Roman" w:eastAsia="Times New Roman" w:cs="Times New Roman"/>
-          <w:i/>
           <w:i/>
           <w:iCs/>
           <w:sz w:val="13"/>
@@ -590,7 +584,6 @@
         <w:rPr>
           <w:rFonts w:ascii="Times New Roman" w:hAnsi="Times New Roman" w:cs="Times New Roman"/>
           <w:i w:val="false"/>
-          <w:i w:val="false"/>
           <w:iCs w:val="false"/>
         </w:rPr>
       </w:pPr>
@@ -615,7 +608,6 @@
         <w:rPr>
           <w:rFonts w:ascii="Times New Roman" w:hAnsi="Times New Roman" w:cs="Times New Roman"/>
           <w:i w:val="false"/>
-          <w:i w:val="false"/>
           <w:iCs w:val="false"/>
         </w:rPr>
       </w:pPr>
@@ -640,7 +632,6 @@
         <w:rPr>
           <w:rFonts w:ascii="Times New Roman" w:hAnsi="Times New Roman" w:cs="Times New Roman"/>
           <w:i w:val="false"/>
-          <w:i w:val="false"/>
           <w:iCs w:val="false"/>
         </w:rPr>
       </w:pPr>
@@ -681,7 +672,6 @@
         <w:rPr>
           <w:rFonts w:ascii="Times New Roman" w:hAnsi="Times New Roman" w:cs="Times New Roman"/>
           <w:i w:val="false"/>
-          <w:i w:val="false"/>
           <w:iCs w:val="false"/>
         </w:rPr>
       </w:pPr>
@@ -793,7 +783,6 @@
         <w:rPr>
           <w:rFonts w:ascii="Times New Roman" w:hAnsi="Times New Roman" w:eastAsia="Times New Roman" w:cs="Times New Roman"/>
           <w:i w:val="false"/>
-          <w:i w:val="false"/>
           <w:iCs w:val="false"/>
         </w:rPr>
       </w:pPr>
@@ -855,7 +844,6 @@
         <w:rPr>
           <w:rFonts w:ascii="Times New Roman" w:hAnsi="Times New Roman" w:eastAsia="Times New Roman" w:cs="Times New Roman"/>
           <w:i w:val="false"/>
-          <w:i w:val="false"/>
           <w:iCs w:val="false"/>
         </w:rPr>
       </w:pPr>
@@ -894,23 +882,23 @@
     <w:p>
       <w:pPr>
         <w:pStyle w:val="ListParagraph"/>
+        <w:bidi w:val="0"/>
         <w:spacing w:lineRule="auto" w:line="240" w:before="120" w:after="120"/>
         <w:ind w:left="360"/>
         <w:contextualSpacing/>
         <w:rPr>
-          <w:rFonts w:ascii="Times New Roman" w:hAnsi="Times New Roman" w:eastAsia="Times New Roman" w:cs="Times New Roman"/>
-          <w:b/>
-          <w:i/>
-          <w:i/>
+          <w:i w:val="false"/>
+          <w:iCs w:val="false"/>
         </w:rPr>
       </w:pPr>
       <w:r>
         <w:rPr>
           <w:rFonts w:eastAsia="Times New Roman" w:cs="Times New Roman" w:ascii="Times New Roman" w:hAnsi="Times New Roman"/>
           <w:bCs/>
-          <w:i/>
-        </w:rPr>
-        <w:t>Paste here the link to your video.</w:t>
+          <w:i w:val="false"/>
+          <w:iCs w:val="false"/>
+        </w:rPr>
+        <w:t>https://youtu.be/Q3Jkgke19Nk</w:t>
       </w:r>
     </w:p>
     <w:sectPr>
@@ -1987,6 +1975,7 @@
     <w:rsid w:val="00c420f8"/>
     <w:pPr>
       <w:widowControl/>
+      <w:suppressAutoHyphens w:val="true"/>
       <w:bidi w:val="0"/>
       <w:spacing w:lineRule="auto" w:line="259" w:before="0" w:after="160"/>
       <w:jc w:val="left"/>
@@ -2001,7 +1990,7 @@
     </w:rPr>
   </w:style>
   <w:style w:type="paragraph" w:styleId="Heading1">
-    <w:name w:val="Heading 1"/>
+    <w:name w:val="heading 1"/>
     <w:basedOn w:val="Normal"/>
     <w:next w:val="Normal"/>
     <w:link w:val="Heading1Char"/>
@@ -2043,8 +2032,8 @@
       <w:szCs w:val="24"/>
     </w:rPr>
   </w:style>
-  <w:style w:type="character" w:styleId="Bullets">
-    <w:name w:val="Bullets"/>
+  <w:style w:type="character" w:styleId="Bulletsuser">
+    <w:name w:val="Bullets (user)"/>
     <w:qFormat/>
     <w:rPr>
       <w:rFonts w:ascii="OpenSymbol" w:hAnsi="OpenSymbol" w:eastAsia="OpenSymbol" w:cs="OpenSymbol"/>
@@ -2082,7 +2071,7 @@
     </w:rPr>
   </w:style>
   <w:style w:type="paragraph" w:styleId="Caption">
-    <w:name w:val="Caption"/>
+    <w:name w:val="caption"/>
     <w:basedOn w:val="Normal"/>
     <w:qFormat/>
     <w:pPr>
@@ -2153,37 +2142,37 @@
         <a:srgbClr val="000000"/>
       </a:dk1>
       <a:lt1>
-        <a:srgbClr val="ffffff"/>
+        <a:srgbClr val="FFFFFF"/>
       </a:lt1>
       <a:dk2>
-        <a:srgbClr val="44546a"/>
+        <a:srgbClr val="44546A"/>
       </a:dk2>
       <a:lt2>
-        <a:srgbClr val="e7e6e6"/>
+        <a:srgbClr val="E7E6E6"/>
       </a:lt2>
       <a:accent1>
-        <a:srgbClr val="4472c4"/>
+        <a:srgbClr val="4472C4"/>
       </a:accent1>
       <a:accent2>
-        <a:srgbClr val="ed7d31"/>
+        <a:srgbClr val="ED7D31"/>
       </a:accent2>
       <a:accent3>
-        <a:srgbClr val="a5a5a5"/>
+        <a:srgbClr val="A5A5A5"/>
       </a:accent3>
       <a:accent4>
-        <a:srgbClr val="ffc000"/>
+        <a:srgbClr val="FFC000"/>
       </a:accent4>
       <a:accent5>
-        <a:srgbClr val="5b9bd5"/>
+        <a:srgbClr val="5B9BD5"/>
       </a:accent5>
       <a:accent6>
-        <a:srgbClr val="70ad47"/>
+        <a:srgbClr val="70AD47"/>
       </a:accent6>
       <a:hlink>
-        <a:srgbClr val="0563c1"/>
+        <a:srgbClr val="0563C1"/>
       </a:hlink>
       <a:folHlink>
-        <a:srgbClr val="954f72"/>
+        <a:srgbClr val="954F72"/>
       </a:folHlink>
     </a:clrScheme>
     <a:fontScheme name="Office">

</xml_diff>